<commit_message>
Update package links for GitHub publishing
Co-authored-by: Copilot <223556219+Copilot@users.noreply.github.com>
</commit_message>
<xml_diff>
--- a/demo/DEMO-INSTRUCTIONS.docx
+++ b/demo/DEMO-INSTRUCTIONS.docx
@@ -24,16 +24,16 @@
     </w:p>
     <w:p>
       <w:pPr>
-        <w:spacing w:after="140" w:before="0"/>
-      </w:pPr>
-      <w:r>
-        <w:rPr>
-          <w:rFonts w:ascii="Aptos" w:cs="Aptos" w:eastAsia="Aptos" w:hAnsi="Aptos"/>
-          <w:b w:val="false"/>
-          <w:bCs w:val="false"/>
-          <w:i/>
-          <w:iCs/>
-          <w:color w:val="59656F"/>
+        <w:spacing w:after="130" w:before="0"/>
+      </w:pPr>
+      <w:r>
+        <w:rPr>
+          <w:rFonts w:ascii="Aptos" w:cs="Aptos" w:eastAsia="Aptos" w:hAnsi="Aptos"/>
+          <w:b w:val="false"/>
+          <w:bCs w:val="false"/>
+          <w:i w:val="false"/>
+          <w:iCs w:val="false"/>
+          <w:color w:val="1F2A2E"/>
           <w:sz w:val="22"/>
           <w:szCs w:val="22"/>
         </w:rPr>
@@ -42,7 +42,7 @@
     </w:p>
     <w:p>
       <w:pPr>
-        <w:spacing w:after="120" w:before="0"/>
+        <w:spacing w:after="130" w:before="0"/>
       </w:pPr>
       <w:r>
         <w:rPr>
@@ -61,7 +61,7 @@
     <w:p>
       <w:pPr>
         <w:pStyle w:val="Heading2"/>
-        <w:spacing w:after="140" w:before="220"/>
+        <w:spacing w:after="130" w:before="220"/>
       </w:pPr>
       <w:r>
         <w:rPr>
@@ -79,7 +79,7 @@
     </w:p>
     <w:p>
       <w:pPr>
-        <w:spacing w:after="120" w:before="0"/>
+        <w:spacing w:after="130" w:before="0"/>
       </w:pPr>
       <w:r>
         <w:rPr>
@@ -98,7 +98,7 @@
     <w:p>
       <w:pPr>
         <w:pStyle w:val="Heading2"/>
-        <w:spacing w:after="140" w:before="220"/>
+        <w:spacing w:after="130" w:before="220"/>
       </w:pPr>
       <w:r>
         <w:rPr>
@@ -116,7 +116,7 @@
     </w:p>
     <w:p>
       <w:pPr>
-        <w:spacing w:after="120" w:before="0"/>
+        <w:spacing w:after="130" w:before="0"/>
       </w:pPr>
       <w:r>
         <w:rPr>
@@ -135,7 +135,7 @@
     <w:p>
       <w:pPr>
         <w:pStyle w:val="Heading2"/>
-        <w:spacing w:after="140" w:before="220"/>
+        <w:spacing w:after="130" w:before="220"/>
       </w:pPr>
       <w:r>
         <w:rPr>
@@ -158,20 +158,20 @@
           <w:ilvl w:val="0"/>
           <w:numId w:val="1"/>
         </w:numPr>
-        <w:spacing w:after="140" w:before="0"/>
-      </w:pPr>
-      <w:r>
-        <w:rPr>
-          <w:rFonts w:ascii="Aptos" w:cs="Aptos" w:eastAsia="Aptos" w:hAnsi="Aptos"/>
-          <w:b w:val="false"/>
-          <w:bCs w:val="false"/>
-          <w:i w:val="false"/>
-          <w:iCs w:val="false"/>
-          <w:color w:val="1F2A2E"/>
-          <w:sz w:val="22"/>
-          <w:szCs w:val="22"/>
-        </w:rPr>
-        <w:t xml:space="preserve">demo/sample-data/Well_Test_Results_Southwest.xlsx</w:t>
+        <w:spacing w:after="130" w:before="0"/>
+      </w:pPr>
+      <w:r>
+        <w:rPr>
+          <w:rFonts w:ascii="Aptos" w:cs="Aptos" w:eastAsia="Aptos" w:hAnsi="Aptos"/>
+          <w:b w:val="false"/>
+          <w:bCs w:val="false"/>
+          <w:i w:val="false"/>
+          <w:iCs w:val="false"/>
+          <w:color w:val="1F2A2E"/>
+          <w:sz w:val="22"/>
+          <w:szCs w:val="22"/>
+        </w:rPr>
+        <w:t xml:space="preserve">Well_Test_Results_Southwest.xlsx - https://github.com/AndrewConniff/oil-gas-wells/blob/main/demo/sample-data/Well_Test_Results_Southwest.xlsx</w:t>
       </w:r>
     </w:p>
     <w:p>
@@ -181,20 +181,20 @@
           <w:ilvl w:val="0"/>
           <w:numId w:val="1"/>
         </w:numPr>
-        <w:spacing w:after="140" w:before="0"/>
-      </w:pPr>
-      <w:r>
-        <w:rPr>
-          <w:rFonts w:ascii="Aptos" w:cs="Aptos" w:eastAsia="Aptos" w:hAnsi="Aptos"/>
-          <w:b w:val="false"/>
-          <w:bCs w:val="false"/>
-          <w:i w:val="false"/>
-          <w:iCs w:val="false"/>
-          <w:color w:val="1F2A2E"/>
-          <w:sz w:val="22"/>
-          <w:szCs w:val="22"/>
-        </w:rPr>
-        <w:t xml:space="preserve">demo/sample-data/Well_Test_Results_Midcontinent.xlsx</w:t>
+        <w:spacing w:after="130" w:before="0"/>
+      </w:pPr>
+      <w:r>
+        <w:rPr>
+          <w:rFonts w:ascii="Aptos" w:cs="Aptos" w:eastAsia="Aptos" w:hAnsi="Aptos"/>
+          <w:b w:val="false"/>
+          <w:bCs w:val="false"/>
+          <w:i w:val="false"/>
+          <w:iCs w:val="false"/>
+          <w:color w:val="1F2A2E"/>
+          <w:sz w:val="22"/>
+          <w:szCs w:val="22"/>
+        </w:rPr>
+        <w:t xml:space="preserve">Well_Test_Results_Midcontinent.xlsx - https://github.com/AndrewConniff/oil-gas-wells/blob/main/demo/sample-data/Well_Test_Results_Midcontinent.xlsx</w:t>
       </w:r>
     </w:p>
     <w:p>
@@ -204,20 +204,20 @@
           <w:ilvl w:val="0"/>
           <w:numId w:val="1"/>
         </w:numPr>
-        <w:spacing w:after="140" w:before="0"/>
-      </w:pPr>
-      <w:r>
-        <w:rPr>
-          <w:rFonts w:ascii="Aptos" w:cs="Aptos" w:eastAsia="Aptos" w:hAnsi="Aptos"/>
-          <w:b w:val="false"/>
-          <w:bCs w:val="false"/>
-          <w:i w:val="false"/>
-          <w:iCs w:val="false"/>
-          <w:color w:val="1F2A2E"/>
-          <w:sz w:val="22"/>
-          <w:szCs w:val="22"/>
-        </w:rPr>
-        <w:t xml:space="preserve">demo/sample-data/Well_Test_Results_Gulf_ArkLaTex.xlsx</w:t>
+        <w:spacing w:after="130" w:before="0"/>
+      </w:pPr>
+      <w:r>
+        <w:rPr>
+          <w:rFonts w:ascii="Aptos" w:cs="Aptos" w:eastAsia="Aptos" w:hAnsi="Aptos"/>
+          <w:b w:val="false"/>
+          <w:bCs w:val="false"/>
+          <w:i w:val="false"/>
+          <w:iCs w:val="false"/>
+          <w:color w:val="1F2A2E"/>
+          <w:sz w:val="22"/>
+          <w:szCs w:val="22"/>
+        </w:rPr>
+        <w:t xml:space="preserve">Well_Test_Results_Gulf_ArkLaTex.xlsx - https://github.com/AndrewConniff/oil-gas-wells/blob/main/demo/sample-data/Well_Test_Results_Gulf_ArkLaTex.xlsx</w:t>
       </w:r>
     </w:p>
     <w:p>
@@ -227,20 +227,20 @@
           <w:ilvl w:val="0"/>
           <w:numId w:val="1"/>
         </w:numPr>
-        <w:spacing w:after="140" w:before="0"/>
-      </w:pPr>
-      <w:r>
-        <w:rPr>
-          <w:rFonts w:ascii="Aptos" w:cs="Aptos" w:eastAsia="Aptos" w:hAnsi="Aptos"/>
-          <w:b w:val="false"/>
-          <w:bCs w:val="false"/>
-          <w:i w:val="false"/>
-          <w:iCs w:val="false"/>
-          <w:color w:val="1F2A2E"/>
-          <w:sz w:val="22"/>
-          <w:szCs w:val="22"/>
-        </w:rPr>
-        <w:t xml:space="preserve">demo/sample-data/Manifest_Template.xlsx</w:t>
+        <w:spacing w:after="130" w:before="0"/>
+      </w:pPr>
+      <w:r>
+        <w:rPr>
+          <w:rFonts w:ascii="Aptos" w:cs="Aptos" w:eastAsia="Aptos" w:hAnsi="Aptos"/>
+          <w:b w:val="false"/>
+          <w:bCs w:val="false"/>
+          <w:i w:val="false"/>
+          <w:iCs w:val="false"/>
+          <w:color w:val="1F2A2E"/>
+          <w:sz w:val="22"/>
+          <w:szCs w:val="22"/>
+        </w:rPr>
+        <w:t xml:space="preserve">Manifest_Template.xlsx - https://github.com/AndrewConniff/oil-gas-wells/blob/main/demo/sample-data/Manifest_Template.xlsx</w:t>
       </w:r>
     </w:p>
     <w:p>
@@ -250,20 +250,20 @@
           <w:ilvl w:val="0"/>
           <w:numId w:val="1"/>
         </w:numPr>
-        <w:spacing w:after="140" w:before="0"/>
-      </w:pPr>
-      <w:r>
-        <w:rPr>
-          <w:rFonts w:ascii="Aptos" w:cs="Aptos" w:eastAsia="Aptos" w:hAnsi="Aptos"/>
-          <w:b w:val="false"/>
-          <w:bCs w:val="false"/>
-          <w:i w:val="false"/>
-          <w:iCs w:val="false"/>
-          <w:color w:val="1F2A2E"/>
-          <w:sz w:val="22"/>
-          <w:szCs w:val="22"/>
-        </w:rPr>
-        <w:t xml:space="preserve">demo/sample-data/Well Brief Template.docx</w:t>
+        <w:spacing w:after="130" w:before="0"/>
+      </w:pPr>
+      <w:r>
+        <w:rPr>
+          <w:rFonts w:ascii="Aptos" w:cs="Aptos" w:eastAsia="Aptos" w:hAnsi="Aptos"/>
+          <w:b w:val="false"/>
+          <w:bCs w:val="false"/>
+          <w:i w:val="false"/>
+          <w:iCs w:val="false"/>
+          <w:color w:val="1F2A2E"/>
+          <w:sz w:val="22"/>
+          <w:szCs w:val="22"/>
+        </w:rPr>
+        <w:t xml:space="preserve">Well Brief Template.docx - https://github.com/AndrewConniff/oil-gas-wells/blob/main/demo/sample-data/Well%20Brief%20Template.docx</w:t>
       </w:r>
     </w:p>
     <w:p>
@@ -273,26 +273,26 @@
           <w:ilvl w:val="0"/>
           <w:numId w:val="1"/>
         </w:numPr>
-        <w:spacing w:after="140" w:before="0"/>
-      </w:pPr>
-      <w:r>
-        <w:rPr>
-          <w:rFonts w:ascii="Aptos" w:cs="Aptos" w:eastAsia="Aptos" w:hAnsi="Aptos"/>
-          <w:b w:val="false"/>
-          <w:bCs w:val="false"/>
-          <w:i w:val="false"/>
-          <w:iCs w:val="false"/>
-          <w:color w:val="1F2A2E"/>
-          <w:sz w:val="22"/>
-          <w:szCs w:val="22"/>
-        </w:rPr>
-        <w:t xml:space="preserve">demo/sample-data/Executive_Rundown_Template.pptx</w:t>
+        <w:spacing w:after="130" w:before="0"/>
+      </w:pPr>
+      <w:r>
+        <w:rPr>
+          <w:rFonts w:ascii="Aptos" w:cs="Aptos" w:eastAsia="Aptos" w:hAnsi="Aptos"/>
+          <w:b w:val="false"/>
+          <w:bCs w:val="false"/>
+          <w:i w:val="false"/>
+          <w:iCs w:val="false"/>
+          <w:color w:val="1F2A2E"/>
+          <w:sz w:val="22"/>
+          <w:szCs w:val="22"/>
+        </w:rPr>
+        <w:t xml:space="preserve">Executive_Rundown_Template.pptx - https://github.com/AndrewConniff/oil-gas-wells/blob/main/demo/sample-data/Executive_Rundown_Template.pptx</w:t>
       </w:r>
     </w:p>
     <w:p>
       <w:pPr>
         <w:pStyle w:val="Heading2"/>
-        <w:spacing w:after="140" w:before="220"/>
+        <w:spacing w:after="130" w:before="220"/>
       </w:pPr>
       <w:r>
         <w:rPr>
@@ -311,7 +311,7 @@
     <w:p>
       <w:pPr>
         <w:pStyle w:val="Heading3"/>
-        <w:spacing w:after="140" w:before="160"/>
+        <w:spacing w:after="130" w:before="160"/>
       </w:pPr>
       <w:r>
         <w:rPr>
@@ -329,7 +329,7 @@
     </w:p>
     <w:p>
       <w:pPr>
-        <w:spacing w:after="120" w:before="0"/>
+        <w:spacing w:after="130" w:before="0"/>
       </w:pPr>
       <w:r>
         <w:rPr>
@@ -347,7 +347,7 @@
     </w:p>
     <w:p>
       <w:pPr>
-        <w:spacing w:after="120" w:before="0"/>
+        <w:spacing w:after="130" w:before="0"/>
       </w:pPr>
       <w:r>
         <w:rPr>
@@ -365,7 +365,7 @@
     </w:p>
     <w:p>
       <w:pPr>
-        <w:spacing w:after="140" w:before="0"/>
+        <w:spacing w:after="130" w:before="0"/>
       </w:pPr>
       <w:r>
         <w:rPr>
@@ -402,7 +402,7 @@
     </w:p>
     <w:p>
       <w:pPr>
-        <w:spacing w:after="140" w:before="0"/>
+        <w:spacing w:after="130" w:before="0"/>
       </w:pPr>
       <w:r>
         <w:rPr>
@@ -420,7 +420,7 @@
     </w:p>
     <w:p>
       <w:pPr>
-        <w:spacing w:after="120" w:before="0"/>
+        <w:spacing w:after="130" w:before="0"/>
       </w:pPr>
       <w:r>
         <w:rPr>
@@ -438,7 +438,7 @@
     </w:p>
     <w:p>
       <w:pPr>
-        <w:spacing w:after="140" w:before="0"/>
+        <w:spacing w:after="130" w:before="0"/>
       </w:pPr>
       <w:r>
         <w:rPr>
@@ -456,7 +456,7 @@
     </w:p>
     <w:p>
       <w:pPr>
-        <w:spacing w:after="120" w:before="0"/>
+        <w:spacing w:after="130" w:before="0"/>
       </w:pPr>
       <w:r>
         <w:rPr>
@@ -474,7 +474,7 @@
     </w:p>
     <w:p>
       <w:pPr>
-        <w:spacing w:after="140" w:before="0"/>
+        <w:spacing w:after="130" w:before="0"/>
       </w:pPr>
       <w:r>
         <w:rPr>
@@ -492,7 +492,7 @@
     </w:p>
     <w:p>
       <w:pPr>
-        <w:spacing w:after="120" w:before="0"/>
+        <w:spacing w:after="130" w:before="0"/>
       </w:pPr>
       <w:r>
         <w:rPr>
@@ -510,7 +510,7 @@
     </w:p>
     <w:p>
       <w:pPr>
-        <w:spacing w:after="140" w:before="0"/>
+        <w:spacing w:after="130" w:before="0"/>
       </w:pPr>
       <w:r>
         <w:rPr>
@@ -528,7 +528,7 @@
     </w:p>
     <w:p>
       <w:pPr>
-        <w:spacing w:after="120" w:before="0"/>
+        <w:spacing w:after="130" w:before="0"/>
       </w:pPr>
       <w:r>
         <w:rPr>
@@ -547,7 +547,7 @@
     <w:p>
       <w:pPr>
         <w:pStyle w:val="Heading3"/>
-        <w:spacing w:after="140" w:before="160"/>
+        <w:spacing w:after="130" w:before="160"/>
       </w:pPr>
       <w:r>
         <w:rPr>
@@ -565,7 +565,7 @@
     </w:p>
     <w:p>
       <w:pPr>
-        <w:spacing w:after="120" w:before="0"/>
+        <w:spacing w:after="130" w:before="0"/>
       </w:pPr>
       <w:r>
         <w:rPr>
@@ -583,7 +583,7 @@
     </w:p>
     <w:p>
       <w:pPr>
-        <w:spacing w:after="120" w:before="0"/>
+        <w:spacing w:after="130" w:before="0"/>
       </w:pPr>
       <w:r>
         <w:rPr>
@@ -601,7 +601,7 @@
     </w:p>
     <w:p>
       <w:pPr>
-        <w:spacing w:after="140" w:before="0"/>
+        <w:spacing w:after="130" w:before="0"/>
       </w:pPr>
       <w:r>
         <w:rPr>
@@ -638,7 +638,7 @@
     </w:p>
     <w:p>
       <w:pPr>
-        <w:spacing w:after="140" w:before="0"/>
+        <w:spacing w:after="130" w:before="0"/>
       </w:pPr>
       <w:r>
         <w:rPr>
@@ -656,7 +656,7 @@
     </w:p>
     <w:p>
       <w:pPr>
-        <w:spacing w:after="120" w:before="0"/>
+        <w:spacing w:after="130" w:before="0"/>
       </w:pPr>
       <w:r>
         <w:rPr>
@@ -674,7 +674,7 @@
     </w:p>
     <w:p>
       <w:pPr>
-        <w:spacing w:after="140" w:before="0"/>
+        <w:spacing w:after="130" w:before="0"/>
       </w:pPr>
       <w:r>
         <w:rPr>
@@ -692,7 +692,7 @@
     </w:p>
     <w:p>
       <w:pPr>
-        <w:spacing w:after="120" w:before="0"/>
+        <w:spacing w:after="130" w:before="0"/>
       </w:pPr>
       <w:r>
         <w:rPr>
@@ -710,7 +710,7 @@
     </w:p>
     <w:p>
       <w:pPr>
-        <w:spacing w:after="140" w:before="0"/>
+        <w:spacing w:after="130" w:before="0"/>
       </w:pPr>
       <w:r>
         <w:rPr>
@@ -728,7 +728,7 @@
     </w:p>
     <w:p>
       <w:pPr>
-        <w:spacing w:after="120" w:before="0"/>
+        <w:spacing w:after="130" w:before="0"/>
       </w:pPr>
       <w:r>
         <w:rPr>
@@ -746,7 +746,7 @@
     </w:p>
     <w:p>
       <w:pPr>
-        <w:spacing w:after="140" w:before="0"/>
+        <w:spacing w:after="130" w:before="0"/>
       </w:pPr>
       <w:r>
         <w:rPr>
@@ -764,7 +764,7 @@
     </w:p>
     <w:p>
       <w:pPr>
-        <w:spacing w:after="120" w:before="0"/>
+        <w:spacing w:after="130" w:before="0"/>
       </w:pPr>
       <w:r>
         <w:rPr>
@@ -783,7 +783,7 @@
     <w:p>
       <w:pPr>
         <w:pStyle w:val="Heading3"/>
-        <w:spacing w:after="140" w:before="160"/>
+        <w:spacing w:after="130" w:before="160"/>
       </w:pPr>
       <w:r>
         <w:rPr>
@@ -801,7 +801,7 @@
     </w:p>
     <w:p>
       <w:pPr>
-        <w:spacing w:after="120" w:before="0"/>
+        <w:spacing w:after="130" w:before="0"/>
       </w:pPr>
       <w:r>
         <w:rPr>
@@ -819,7 +819,7 @@
     </w:p>
     <w:p>
       <w:pPr>
-        <w:spacing w:after="120" w:before="0"/>
+        <w:spacing w:after="130" w:before="0"/>
       </w:pPr>
       <w:r>
         <w:rPr>
@@ -837,7 +837,7 @@
     </w:p>
     <w:p>
       <w:pPr>
-        <w:spacing w:after="140" w:before="0"/>
+        <w:spacing w:after="130" w:before="0"/>
       </w:pPr>
       <w:r>
         <w:rPr>
@@ -874,7 +874,7 @@
     </w:p>
     <w:p>
       <w:pPr>
-        <w:spacing w:after="140" w:before="0"/>
+        <w:spacing w:after="130" w:before="0"/>
       </w:pPr>
       <w:r>
         <w:rPr>
@@ -892,7 +892,7 @@
     </w:p>
     <w:p>
       <w:pPr>
-        <w:spacing w:after="120" w:before="0"/>
+        <w:spacing w:after="130" w:before="0"/>
       </w:pPr>
       <w:r>
         <w:rPr>
@@ -910,7 +910,7 @@
     </w:p>
     <w:p>
       <w:pPr>
-        <w:spacing w:after="140" w:before="0"/>
+        <w:spacing w:after="130" w:before="0"/>
       </w:pPr>
       <w:r>
         <w:rPr>
@@ -928,7 +928,7 @@
     </w:p>
     <w:p>
       <w:pPr>
-        <w:spacing w:after="120" w:before="0"/>
+        <w:spacing w:after="130" w:before="0"/>
       </w:pPr>
       <w:r>
         <w:rPr>
@@ -946,7 +946,7 @@
     </w:p>
     <w:p>
       <w:pPr>
-        <w:spacing w:after="140" w:before="0"/>
+        <w:spacing w:after="130" w:before="0"/>
       </w:pPr>
       <w:r>
         <w:rPr>
@@ -964,7 +964,7 @@
     </w:p>
     <w:p>
       <w:pPr>
-        <w:spacing w:after="120" w:before="0"/>
+        <w:spacing w:after="130" w:before="0"/>
       </w:pPr>
       <w:r>
         <w:rPr>
@@ -982,7 +982,7 @@
     </w:p>
     <w:p>
       <w:pPr>
-        <w:spacing w:after="140" w:before="0"/>
+        <w:spacing w:after="130" w:before="0"/>
       </w:pPr>
       <w:r>
         <w:rPr>
@@ -1000,7 +1000,7 @@
     </w:p>
     <w:p>
       <w:pPr>
-        <w:spacing w:after="120" w:before="0"/>
+        <w:spacing w:after="130" w:before="0"/>
       </w:pPr>
       <w:r>
         <w:rPr>
@@ -1019,7 +1019,7 @@
     <w:p>
       <w:pPr>
         <w:pStyle w:val="Heading3"/>
-        <w:spacing w:after="140" w:before="160"/>
+        <w:spacing w:after="130" w:before="160"/>
       </w:pPr>
       <w:r>
         <w:rPr>
@@ -1037,7 +1037,7 @@
     </w:p>
     <w:p>
       <w:pPr>
-        <w:spacing w:after="120" w:before="0"/>
+        <w:spacing w:after="130" w:before="0"/>
       </w:pPr>
       <w:r>
         <w:rPr>
@@ -1055,7 +1055,7 @@
     </w:p>
     <w:p>
       <w:pPr>
-        <w:spacing w:after="120" w:before="0"/>
+        <w:spacing w:after="130" w:before="0"/>
       </w:pPr>
       <w:r>
         <w:rPr>
@@ -1073,7 +1073,7 @@
     </w:p>
     <w:p>
       <w:pPr>
-        <w:spacing w:after="140" w:before="0"/>
+        <w:spacing w:after="130" w:before="0"/>
       </w:pPr>
       <w:r>
         <w:rPr>
@@ -1110,7 +1110,7 @@
     </w:p>
     <w:p>
       <w:pPr>
-        <w:spacing w:after="140" w:before="0"/>
+        <w:spacing w:after="130" w:before="0"/>
       </w:pPr>
       <w:r>
         <w:rPr>
@@ -1128,7 +1128,7 @@
     </w:p>
     <w:p>
       <w:pPr>
-        <w:spacing w:after="120" w:before="0"/>
+        <w:spacing w:after="130" w:before="0"/>
       </w:pPr>
       <w:r>
         <w:rPr>
@@ -1146,7 +1146,7 @@
     </w:p>
     <w:p>
       <w:pPr>
-        <w:spacing w:after="140" w:before="0"/>
+        <w:spacing w:after="130" w:before="0"/>
       </w:pPr>
       <w:r>
         <w:rPr>
@@ -1164,7 +1164,7 @@
     </w:p>
     <w:p>
       <w:pPr>
-        <w:spacing w:after="120" w:before="0"/>
+        <w:spacing w:after="130" w:before="0"/>
       </w:pPr>
       <w:r>
         <w:rPr>
@@ -1182,7 +1182,7 @@
     </w:p>
     <w:p>
       <w:pPr>
-        <w:spacing w:after="140" w:before="0"/>
+        <w:spacing w:after="130" w:before="0"/>
       </w:pPr>
       <w:r>
         <w:rPr>
@@ -1200,7 +1200,7 @@
     </w:p>
     <w:p>
       <w:pPr>
-        <w:spacing w:after="120" w:before="0"/>
+        <w:spacing w:after="130" w:before="0"/>
       </w:pPr>
       <w:r>
         <w:rPr>
@@ -1218,7 +1218,7 @@
     </w:p>
     <w:p>
       <w:pPr>
-        <w:spacing w:after="140" w:before="0"/>
+        <w:spacing w:after="130" w:before="0"/>
       </w:pPr>
       <w:r>
         <w:rPr>
@@ -1236,7 +1236,7 @@
     </w:p>
     <w:p>
       <w:pPr>
-        <w:spacing w:after="120" w:before="0"/>
+        <w:spacing w:after="130" w:before="0"/>
       </w:pPr>
       <w:r>
         <w:rPr>
@@ -1255,7 +1255,7 @@
     <w:p>
       <w:pPr>
         <w:pStyle w:val="Heading3"/>
-        <w:spacing w:after="140" w:before="160"/>
+        <w:spacing w:after="130" w:before="160"/>
       </w:pPr>
       <w:r>
         <w:rPr>
@@ -1273,7 +1273,7 @@
     </w:p>
     <w:p>
       <w:pPr>
-        <w:spacing w:after="120" w:before="0"/>
+        <w:spacing w:after="130" w:before="0"/>
       </w:pPr>
       <w:r>
         <w:rPr>
@@ -1291,7 +1291,7 @@
     </w:p>
     <w:p>
       <w:pPr>
-        <w:spacing w:after="120" w:before="0"/>
+        <w:spacing w:after="130" w:before="0"/>
       </w:pPr>
       <w:r>
         <w:rPr>
@@ -1309,7 +1309,7 @@
     </w:p>
     <w:p>
       <w:pPr>
-        <w:spacing w:after="140" w:before="0"/>
+        <w:spacing w:after="130" w:before="0"/>
       </w:pPr>
       <w:r>
         <w:rPr>
@@ -1346,7 +1346,7 @@
     </w:p>
     <w:p>
       <w:pPr>
-        <w:spacing w:after="140" w:before="0"/>
+        <w:spacing w:after="130" w:before="0"/>
       </w:pPr>
       <w:r>
         <w:rPr>
@@ -1364,7 +1364,7 @@
     </w:p>
     <w:p>
       <w:pPr>
-        <w:spacing w:after="120" w:before="0"/>
+        <w:spacing w:after="130" w:before="0"/>
       </w:pPr>
       <w:r>
         <w:rPr>
@@ -1382,7 +1382,7 @@
     </w:p>
     <w:p>
       <w:pPr>
-        <w:spacing w:after="140" w:before="0"/>
+        <w:spacing w:after="130" w:before="0"/>
       </w:pPr>
       <w:r>
         <w:rPr>
@@ -1400,7 +1400,7 @@
     </w:p>
     <w:p>
       <w:pPr>
-        <w:spacing w:after="120" w:before="0"/>
+        <w:spacing w:after="130" w:before="0"/>
       </w:pPr>
       <w:r>
         <w:rPr>
@@ -1418,7 +1418,7 @@
     </w:p>
     <w:p>
       <w:pPr>
-        <w:spacing w:after="140" w:before="0"/>
+        <w:spacing w:after="130" w:before="0"/>
       </w:pPr>
       <w:r>
         <w:rPr>
@@ -1436,7 +1436,7 @@
     </w:p>
     <w:p>
       <w:pPr>
-        <w:spacing w:after="120" w:before="0"/>
+        <w:spacing w:after="130" w:before="0"/>
       </w:pPr>
       <w:r>
         <w:rPr>
@@ -1454,7 +1454,7 @@
     </w:p>
     <w:p>
       <w:pPr>
-        <w:spacing w:after="140" w:before="0"/>
+        <w:spacing w:after="130" w:before="0"/>
       </w:pPr>
       <w:r>
         <w:rPr>
@@ -1472,7 +1472,7 @@
     </w:p>
     <w:p>
       <w:pPr>
-        <w:spacing w:after="120" w:before="0"/>
+        <w:spacing w:after="130" w:before="0"/>
       </w:pPr>
       <w:r>
         <w:rPr>
@@ -1491,7 +1491,7 @@
     <w:p>
       <w:pPr>
         <w:pStyle w:val="Heading2"/>
-        <w:spacing w:after="140" w:before="220"/>
+        <w:spacing w:after="130" w:before="220"/>
       </w:pPr>
       <w:r>
         <w:rPr>
@@ -1509,7 +1509,7 @@
     </w:p>
     <w:p>
       <w:pPr>
-        <w:spacing w:after="120" w:before="0"/>
+        <w:spacing w:after="130" w:before="0"/>
       </w:pPr>
       <w:r>
         <w:rPr>
@@ -1528,7 +1528,7 @@
     <w:p>
       <w:pPr>
         <w:pStyle w:val="Heading2"/>
-        <w:spacing w:after="140" w:before="220"/>
+        <w:spacing w:after="130" w:before="220"/>
       </w:pPr>
       <w:r>
         <w:rPr>
@@ -1546,7 +1546,7 @@
     </w:p>
     <w:p>
       <w:pPr>
-        <w:spacing w:after="120" w:before="0"/>
+        <w:spacing w:after="130" w:before="0"/>
       </w:pPr>
       <w:r>
         <w:rPr>

</xml_diff>